<commit_message>
Implemented LLM's output validation of device, configuration and claim + evidence, riorganized code and added comments to explain functions
</commit_message>
<xml_diff>
--- a/report/Report_Tesi_Aggiornamento_fine_Agosto_2026.docx
+++ b/report/Report_Tesi_Aggiornamento_fine_Agosto_2026.docx
@@ -725,44 +725,62 @@
       <w:pPr>
         <w:pStyle w:val="Titolo1"/>
         <w:spacing w:before="320" w:after="120"/>
-        <w:rPr>
-          <w:lang w:val="en-US"/>
-        </w:rPr>
-      </w:pPr>
-      <w:proofErr w:type="spellStart"/>
-      <w:r>
-        <w:rPr>
-          <w:lang w:val="en-US"/>
-        </w:rPr>
+      </w:pPr>
+      <w:r>
         <w:t>Riferimenti</w:t>
       </w:r>
-      <w:proofErr w:type="spellEnd"/>
     </w:p>
     <w:p>
-      <w:pPr>
-        <w:rPr>
-          <w:lang w:val="en-US"/>
-        </w:rPr>
-      </w:pPr>
-      <w:r>
-        <w:rPr>
-          <w:lang w:val="en-US"/>
-        </w:rPr>
+      <w:r>
         <w:t xml:space="preserve">[1] N. </w:t>
       </w:r>
       <w:proofErr w:type="spellStart"/>
       <w:r>
-        <w:rPr>
-          <w:lang w:val="en-US"/>
-        </w:rPr>
         <w:t>Quetschlich</w:t>
       </w:r>
       <w:proofErr w:type="spellEnd"/>
       <w:r>
-        <w:rPr>
-          <w:lang w:val="en-US"/>
-        </w:rPr>
-        <w:t>, L. Burgholzer, R. Wille, MQT Predictor: Automatic Device Selection with Device-Specific Circuit Compilation for Quantum Computing, ACM Transactions on Quantum Computing, 2025.</w:t>
+        <w:t xml:space="preserve">, L. Burgholzer, R. Wille, MQT </w:t>
+      </w:r>
+      <w:proofErr w:type="spellStart"/>
+      <w:r>
+        <w:t>Predictor</w:t>
+      </w:r>
+      <w:proofErr w:type="spellEnd"/>
+      <w:r>
+        <w:t xml:space="preserve">: </w:t>
+      </w:r>
+      <w:proofErr w:type="spellStart"/>
+      <w:r>
+        <w:t>Automatic</w:t>
+      </w:r>
+      <w:proofErr w:type="spellEnd"/>
+      <w:r>
+        <w:t xml:space="preserve"> Device </w:t>
+      </w:r>
+      <w:proofErr w:type="spellStart"/>
+      <w:r>
+        <w:t>Selection</w:t>
+      </w:r>
+      <w:proofErr w:type="spellEnd"/>
+      <w:r>
+        <w:t xml:space="preserve"> with Device-</w:t>
+      </w:r>
+      <w:proofErr w:type="spellStart"/>
+      <w:r>
+        <w:t>Specific</w:t>
+      </w:r>
+      <w:proofErr w:type="spellEnd"/>
+      <w:r>
+        <w:t xml:space="preserve"> Circuit Compilation for Quantum Computing, ACM </w:t>
+      </w:r>
+      <w:proofErr w:type="spellStart"/>
+      <w:r>
+        <w:t>Transactions</w:t>
+      </w:r>
+      <w:proofErr w:type="spellEnd"/>
+      <w:r>
+        <w:t xml:space="preserve"> on Quantum Computing, 2025.</w:t>
       </w:r>
     </w:p>
     <w:p>

</xml_diff>